<commit_message>
docs: add full prompt examples to benchmark_methods.docx
LLM methods (5, 6) now include a Prompt subsection between Process
and Output. Shows the exact prompt text sent to the language model.

Method 5 (LLM A1): two prompts
  - Tingkat prompt: rules, heuristics, approved options, full text
  - Free text prompt: field extraction, max 100 chars

Method 6 (LLM v3): two prompts
  - Variant A: context-only, no raw text, v3 heuristics
  - Variant B: context + minimized text (~300 chars)

Prompt format: monospace block with <placeholder> markers for
dynamic values (raw text, known fields).

Structure per LLM method:
  Overview > Input > Process > Prompt > Output > Configuration >
  Strengths > Limitations > Code Reference

Non-LLM methods unchanged.

Generated with docx-js. Forced-add: .gitignore excludes *.docx.
</commit_message>
<xml_diff>
--- a/docs/benchmark_methods.docx
+++ b/docs/benchmark_methods.docx
@@ -120,7 +120,7 @@
           <w:sz w:val="22"/>
           <w:szCs w:val="22"/>
         </w:rPr>
-        <w:t xml:space="preserve">This separation lets you read the narrative to understand a method. You can check the Code Reference only when you need the exact location.</w:t>
+        <w:t xml:space="preserve">LLM methods also include a Prompt subsection. This subsection shows the full prompt text that is sent to the language model.</w:t>
       </w:r>
     </w:p>
     <w:p>
@@ -4438,7 +4438,7 @@
           <w:sz w:val="22"/>
           <w:szCs w:val="22"/>
         </w:rPr>
-        <w:t xml:space="preserve">No error handling between methods (one failure does not affect the other)</w:t>
+        <w:t xml:space="preserve">No error handling between methods</w:t>
       </w:r>
     </w:p>
     <w:p>
@@ -6898,7 +6898,7 @@
           <w:sz w:val="22"/>
           <w:szCs w:val="22"/>
         </w:rPr>
-        <w:t xml:space="preserve">Validate the response. For tingkat, the response is checked against the approved options. For other fields, the response is checked for length and rejection patterns (TIDAK_DITEMUKAN, etc.).</w:t>
+        <w:t xml:space="preserve">Validate the response. For tingkat, the response is checked against the approved options. For other fields, the response is checked for length and rejection patterns.</w:t>
       </w:r>
     </w:p>
     <w:p>
@@ -6928,7 +6928,794 @@
         <w:rPr>
           <w:rFonts w:ascii="Arial" w:cs="Arial" w:eastAsia="Arial" w:hAnsi="Arial"/>
         </w:rPr>
-        <w:t xml:space="preserve">7.4 Output</w:t>
+        <w:t xml:space="preserve">7.4 Prompt</w:t>
+      </w:r>
+    </w:p>
+    <w:p>
+      <w:pPr>
+        <w:spacing w:after="100"/>
+      </w:pPr>
+      <w:r>
+        <w:rPr>
+          <w:rFonts w:ascii="Arial" w:cs="Arial" w:eastAsia="Arial" w:hAnsi="Arial"/>
+          <w:sz w:val="22"/>
+          <w:szCs w:val="22"/>
+        </w:rPr>
+        <w:t xml:space="preserve">The prompt tells the language model exactly what to extract. Each prompt contains instructions, rules, heuristic guidance, approved options, the certificate text (or context), and the answer format.</w:t>
+      </w:r>
+    </w:p>
+    <w:p>
+      <w:pPr>
+        <w:pStyle w:val="Heading3"/>
+        <w:spacing w:after="80" w:before="180"/>
+      </w:pPr>
+      <w:r>
+        <w:rPr>
+          <w:rFonts w:ascii="Arial" w:cs="Arial" w:eastAsia="Arial" w:hAnsi="Arial"/>
+        </w:rPr>
+        <w:t xml:space="preserve">Tingkat Prompt</w:t>
+      </w:r>
+    </w:p>
+    <w:p>
+      <w:pPr>
+        <w:spacing w:after="0"/>
+      </w:pPr>
+      <w:r>
+        <w:rPr>
+          <w:rFonts w:ascii="Consolas" w:cs="Consolas" w:eastAsia="Consolas" w:hAnsi="Consolas"/>
+          <w:color w:val="333333"/>
+          <w:sz w:val="18"/>
+          <w:szCs w:val="18"/>
+        </w:rPr>
+        <w:t xml:space="preserve">Tentukan TINGKAT KEGIATAN dari sertifikat berikut.</w:t>
+      </w:r>
+    </w:p>
+    <w:p>
+      <w:pPr>
+        <w:spacing w:after="0"/>
+      </w:pPr>
+      <w:r>
+        <w:rPr>
+          <w:rFonts w:ascii="Consolas" w:cs="Consolas" w:eastAsia="Consolas" w:hAnsi="Consolas"/>
+          <w:color w:val="333333"/>
+          <w:sz w:val="18"/>
+          <w:szCs w:val="18"/>
+        </w:rPr>
+        <w:t xml:space="preserve"/>
+      </w:r>
+    </w:p>
+    <w:p>
+      <w:pPr>
+        <w:spacing w:after="0"/>
+      </w:pPr>
+      <w:r>
+        <w:rPr>
+          <w:rFonts w:ascii="Consolas" w:cs="Consolas" w:eastAsia="Consolas" w:hAnsi="Consolas"/>
+          <w:color w:val="333333"/>
+          <w:sz w:val="18"/>
+          <w:szCs w:val="18"/>
+        </w:rPr>
+        <w:t xml:space="preserve">ATURAN WAJIB:</w:t>
+      </w:r>
+    </w:p>
+    <w:p>
+      <w:pPr>
+        <w:spacing w:after="0"/>
+      </w:pPr>
+      <w:r>
+        <w:rPr>
+          <w:rFonts w:ascii="Consolas" w:cs="Consolas" w:eastAsia="Consolas" w:hAnsi="Consolas"/>
+          <w:color w:val="333333"/>
+          <w:sz w:val="18"/>
+          <w:szCs w:val="18"/>
+        </w:rPr>
+        <w:t xml:space="preserve">- Jawaban HARUS persis salah satu dari opsi di bawah</w:t>
+      </w:r>
+    </w:p>
+    <w:p>
+      <w:pPr>
+        <w:spacing w:after="0"/>
+      </w:pPr>
+      <w:r>
+        <w:rPr>
+          <w:rFonts w:ascii="Consolas" w:cs="Consolas" w:eastAsia="Consolas" w:hAnsi="Consolas"/>
+          <w:color w:val="333333"/>
+          <w:sz w:val="18"/>
+          <w:szCs w:val="18"/>
+        </w:rPr>
+        <w:t xml:space="preserve">- JANGAN jawab selain opsi ini</w:t>
+      </w:r>
+    </w:p>
+    <w:p>
+      <w:pPr>
+        <w:spacing w:after="0"/>
+      </w:pPr>
+      <w:r>
+        <w:rPr>
+          <w:rFonts w:ascii="Consolas" w:cs="Consolas" w:eastAsia="Consolas" w:hAnsi="Consolas"/>
+          <w:color w:val="333333"/>
+          <w:sz w:val="18"/>
+          <w:szCs w:val="18"/>
+        </w:rPr>
+        <w:t xml:space="preserve"/>
+      </w:r>
+    </w:p>
+    <w:p>
+      <w:pPr>
+        <w:spacing w:after="0"/>
+      </w:pPr>
+      <w:r>
+        <w:rPr>
+          <w:rFonts w:ascii="Consolas" w:cs="Consolas" w:eastAsia="Consolas" w:hAnsi="Consolas"/>
+          <w:color w:val="333333"/>
+          <w:sz w:val="18"/>
+          <w:szCs w:val="18"/>
+        </w:rPr>
+        <w:t xml:space="preserve">PETUNJUK TINGKAT:</w:t>
+      </w:r>
+    </w:p>
+    <w:p>
+      <w:pPr>
+        <w:spacing w:after="0"/>
+      </w:pPr>
+      <w:r>
+        <w:rPr>
+          <w:rFonts w:ascii="Consolas" w:cs="Consolas" w:eastAsia="Consolas" w:hAnsi="Consolas"/>
+          <w:color w:val="333333"/>
+          <w:sz w:val="18"/>
+          <w:szCs w:val="18"/>
+        </w:rPr>
+        <w:t xml:space="preserve">- Jika diselenggarakan oleh BEM/Badan Eksekutif Mahasiswa tingkat FAKULTAS</w:t>
+      </w:r>
+    </w:p>
+    <w:p>
+      <w:pPr>
+        <w:spacing w:after="0"/>
+      </w:pPr>
+      <w:r>
+        <w:rPr>
+          <w:rFonts w:ascii="Consolas" w:cs="Consolas" w:eastAsia="Consolas" w:hAnsi="Consolas"/>
+          <w:color w:val="333333"/>
+          <w:sz w:val="18"/>
+          <w:szCs w:val="18"/>
+        </w:rPr>
+        <w:t xml:space="preserve">  (BEM FEB, BEM FKM, BEM FTMM), maka == Fakultas</w:t>
+      </w:r>
+    </w:p>
+    <w:p>
+      <w:pPr>
+        <w:spacing w:after="0"/>
+      </w:pPr>
+      <w:r>
+        <w:rPr>
+          <w:rFonts w:ascii="Consolas" w:cs="Consolas" w:eastAsia="Consolas" w:hAnsi="Consolas"/>
+          <w:color w:val="333333"/>
+          <w:sz w:val="18"/>
+          <w:szCs w:val="18"/>
+        </w:rPr>
+        <w:t xml:space="preserve">- Jika diselenggarakan oleh HIMA/Himpunan Mahasiswa</w:t>
+      </w:r>
+    </w:p>
+    <w:p>
+      <w:pPr>
+        <w:spacing w:after="0"/>
+      </w:pPr>
+      <w:r>
+        <w:rPr>
+          <w:rFonts w:ascii="Consolas" w:cs="Consolas" w:eastAsia="Consolas" w:hAnsi="Consolas"/>
+          <w:color w:val="333333"/>
+          <w:sz w:val="18"/>
+          <w:szCs w:val="18"/>
+        </w:rPr>
+        <w:t xml:space="preserve">  (HIMATESDA, HIMANO), maka == Departemen/Program Studi</w:t>
+      </w:r>
+    </w:p>
+    <w:p>
+      <w:pPr>
+        <w:spacing w:after="0"/>
+      </w:pPr>
+      <w:r>
+        <w:rPr>
+          <w:rFonts w:ascii="Consolas" w:cs="Consolas" w:eastAsia="Consolas" w:hAnsi="Consolas"/>
+          <w:color w:val="333333"/>
+          <w:sz w:val="18"/>
+          <w:szCs w:val="18"/>
+        </w:rPr>
+        <w:t xml:space="preserve">- Jika diselenggarakan oleh BEM Universitas, Rektorat,</w:t>
+      </w:r>
+    </w:p>
+    <w:p>
+      <w:pPr>
+        <w:spacing w:after="0"/>
+      </w:pPr>
+      <w:r>
+        <w:rPr>
+          <w:rFonts w:ascii="Consolas" w:cs="Consolas" w:eastAsia="Consolas" w:hAnsi="Consolas"/>
+          <w:color w:val="333333"/>
+          <w:sz w:val="18"/>
+          <w:szCs w:val="18"/>
+        </w:rPr>
+        <w:t xml:space="preserve">  Direktorat Kemahasiswaan, maka == Universitas</w:t>
+      </w:r>
+    </w:p>
+    <w:p>
+      <w:pPr>
+        <w:spacing w:after="0"/>
+      </w:pPr>
+      <w:r>
+        <w:rPr>
+          <w:rFonts w:ascii="Consolas" w:cs="Consolas" w:eastAsia="Consolas" w:hAnsi="Consolas"/>
+          <w:color w:val="333333"/>
+          <w:sz w:val="18"/>
+          <w:szCs w:val="18"/>
+        </w:rPr>
+        <w:t xml:space="preserve">- Jika kegiatan berskala nasional (lomba nasional, webinar nasional),</w:t>
+      </w:r>
+    </w:p>
+    <w:p>
+      <w:pPr>
+        <w:spacing w:after="0"/>
+      </w:pPr>
+      <w:r>
+        <w:rPr>
+          <w:rFonts w:ascii="Consolas" w:cs="Consolas" w:eastAsia="Consolas" w:hAnsi="Consolas"/>
+          <w:color w:val="333333"/>
+          <w:sz w:val="18"/>
+          <w:szCs w:val="18"/>
+        </w:rPr>
+        <w:t xml:space="preserve">  maka == Nasional</w:t>
+      </w:r>
+    </w:p>
+    <w:p>
+      <w:pPr>
+        <w:spacing w:after="0"/>
+      </w:pPr>
+      <w:r>
+        <w:rPr>
+          <w:rFonts w:ascii="Consolas" w:cs="Consolas" w:eastAsia="Consolas" w:hAnsi="Consolas"/>
+          <w:color w:val="333333"/>
+          <w:sz w:val="18"/>
+          <w:szCs w:val="18"/>
+        </w:rPr>
+        <w:t xml:space="preserve">- Jika kegiatan berskala internasional (konferensi internasional),</w:t>
+      </w:r>
+    </w:p>
+    <w:p>
+      <w:pPr>
+        <w:spacing w:after="0"/>
+      </w:pPr>
+      <w:r>
+        <w:rPr>
+          <w:rFonts w:ascii="Consolas" w:cs="Consolas" w:eastAsia="Consolas" w:hAnsi="Consolas"/>
+          <w:color w:val="333333"/>
+          <w:sz w:val="18"/>
+          <w:szCs w:val="18"/>
+        </w:rPr>
+        <w:t xml:space="preserve">  maka == Internasional</w:t>
+      </w:r>
+    </w:p>
+    <w:p>
+      <w:pPr>
+        <w:spacing w:after="0"/>
+      </w:pPr>
+      <w:r>
+        <w:rPr>
+          <w:rFonts w:ascii="Consolas" w:cs="Consolas" w:eastAsia="Consolas" w:hAnsi="Consolas"/>
+          <w:color w:val="333333"/>
+          <w:sz w:val="18"/>
+          <w:szCs w:val="18"/>
+        </w:rPr>
+        <w:t xml:space="preserve">- 'UNIVERSITAS AIRLANGGA' adalah institusi induk, BUKAN penentu tingkat</w:t>
+      </w:r>
+    </w:p>
+    <w:p>
+      <w:pPr>
+        <w:spacing w:after="0"/>
+      </w:pPr>
+      <w:r>
+        <w:rPr>
+          <w:rFonts w:ascii="Consolas" w:cs="Consolas" w:eastAsia="Consolas" w:hAnsi="Consolas"/>
+          <w:color w:val="333333"/>
+          <w:sz w:val="18"/>
+          <w:szCs w:val="18"/>
+        </w:rPr>
+        <w:t xml:space="preserve"/>
+      </w:r>
+    </w:p>
+    <w:p>
+      <w:pPr>
+        <w:spacing w:after="0"/>
+      </w:pPr>
+      <w:r>
+        <w:rPr>
+          <w:rFonts w:ascii="Consolas" w:cs="Consolas" w:eastAsia="Consolas" w:hAnsi="Consolas"/>
+          <w:color w:val="333333"/>
+          <w:sz w:val="18"/>
+          <w:szCs w:val="18"/>
+        </w:rPr>
+        <w:t xml:space="preserve">Opsi yang diizinkan:</w:t>
+      </w:r>
+    </w:p>
+    <w:p>
+      <w:pPr>
+        <w:spacing w:after="0"/>
+      </w:pPr>
+      <w:r>
+        <w:rPr>
+          <w:rFonts w:ascii="Consolas" w:cs="Consolas" w:eastAsia="Consolas" w:hAnsi="Consolas"/>
+          <w:color w:val="333333"/>
+          <w:sz w:val="18"/>
+          <w:szCs w:val="18"/>
+        </w:rPr>
+        <w:t xml:space="preserve">- Internasional</w:t>
+      </w:r>
+    </w:p>
+    <w:p>
+      <w:pPr>
+        <w:spacing w:after="0"/>
+      </w:pPr>
+      <w:r>
+        <w:rPr>
+          <w:rFonts w:ascii="Consolas" w:cs="Consolas" w:eastAsia="Consolas" w:hAnsi="Consolas"/>
+          <w:color w:val="333333"/>
+          <w:sz w:val="18"/>
+          <w:szCs w:val="18"/>
+        </w:rPr>
+        <w:t xml:space="preserve">- Nasional</w:t>
+      </w:r>
+    </w:p>
+    <w:p>
+      <w:pPr>
+        <w:spacing w:after="0"/>
+      </w:pPr>
+      <w:r>
+        <w:rPr>
+          <w:rFonts w:ascii="Consolas" w:cs="Consolas" w:eastAsia="Consolas" w:hAnsi="Consolas"/>
+          <w:color w:val="333333"/>
+          <w:sz w:val="18"/>
+          <w:szCs w:val="18"/>
+        </w:rPr>
+        <w:t xml:space="preserve">- Universitas</w:t>
+      </w:r>
+    </w:p>
+    <w:p>
+      <w:pPr>
+        <w:spacing w:after="0"/>
+      </w:pPr>
+      <w:r>
+        <w:rPr>
+          <w:rFonts w:ascii="Consolas" w:cs="Consolas" w:eastAsia="Consolas" w:hAnsi="Consolas"/>
+          <w:color w:val="333333"/>
+          <w:sz w:val="18"/>
+          <w:szCs w:val="18"/>
+        </w:rPr>
+        <w:t xml:space="preserve">- Fakultas</w:t>
+      </w:r>
+    </w:p>
+    <w:p>
+      <w:pPr>
+        <w:spacing w:after="0"/>
+      </w:pPr>
+      <w:r>
+        <w:rPr>
+          <w:rFonts w:ascii="Consolas" w:cs="Consolas" w:eastAsia="Consolas" w:hAnsi="Consolas"/>
+          <w:color w:val="333333"/>
+          <w:sz w:val="18"/>
+          <w:szCs w:val="18"/>
+        </w:rPr>
+        <w:t xml:space="preserve">- Departemen/Program Studi</w:t>
+      </w:r>
+    </w:p>
+    <w:p>
+      <w:pPr>
+        <w:spacing w:after="0"/>
+      </w:pPr>
+      <w:r>
+        <w:rPr>
+          <w:rFonts w:ascii="Consolas" w:cs="Consolas" w:eastAsia="Consolas" w:hAnsi="Consolas"/>
+          <w:color w:val="333333"/>
+          <w:sz w:val="18"/>
+          <w:szCs w:val="18"/>
+        </w:rPr>
+        <w:t xml:space="preserve">- Lainnya</w:t>
+      </w:r>
+    </w:p>
+    <w:p>
+      <w:pPr>
+        <w:spacing w:after="0"/>
+      </w:pPr>
+      <w:r>
+        <w:rPr>
+          <w:rFonts w:ascii="Consolas" w:cs="Consolas" w:eastAsia="Consolas" w:hAnsi="Consolas"/>
+          <w:color w:val="333333"/>
+          <w:sz w:val="18"/>
+          <w:szCs w:val="18"/>
+        </w:rPr>
+        <w:t xml:space="preserve"/>
+      </w:r>
+    </w:p>
+    <w:p>
+      <w:pPr>
+        <w:spacing w:after="0"/>
+      </w:pPr>
+      <w:r>
+        <w:rPr>
+          <w:rFonts w:ascii="Consolas" w:cs="Consolas" w:eastAsia="Consolas" w:hAnsi="Consolas"/>
+          <w:color w:val="333333"/>
+          <w:sz w:val="18"/>
+          <w:szCs w:val="18"/>
+        </w:rPr>
+        <w:t xml:space="preserve">Teks sertifikat:</w:t>
+      </w:r>
+    </w:p>
+    <w:p>
+      <w:pPr>
+        <w:spacing w:after="0"/>
+      </w:pPr>
+      <w:r>
+        <w:rPr>
+          <w:rFonts w:ascii="Consolas" w:cs="Consolas" w:eastAsia="Consolas" w:hAnsi="Consolas"/>
+          <w:color w:val="333333"/>
+          <w:sz w:val="18"/>
+          <w:szCs w:val="18"/>
+        </w:rPr>
+        <w:t xml:space="preserve">&lt;full raw text of certificate&gt;</w:t>
+      </w:r>
+    </w:p>
+    <w:p>
+      <w:pPr>
+        <w:spacing w:after="0"/>
+      </w:pPr>
+      <w:r>
+        <w:rPr>
+          <w:rFonts w:ascii="Consolas" w:cs="Consolas" w:eastAsia="Consolas" w:hAnsi="Consolas"/>
+          <w:color w:val="333333"/>
+          <w:sz w:val="18"/>
+          <w:szCs w:val="18"/>
+        </w:rPr>
+        <w:t xml:space="preserve"/>
+      </w:r>
+    </w:p>
+    <w:p>
+      <w:pPr>
+        <w:spacing w:after="0"/>
+      </w:pPr>
+      <w:r>
+        <w:rPr>
+          <w:rFonts w:ascii="Consolas" w:cs="Consolas" w:eastAsia="Consolas" w:hAnsi="Consolas"/>
+          <w:color w:val="333333"/>
+          <w:sz w:val="18"/>
+          <w:szCs w:val="18"/>
+        </w:rPr>
+        <w:t xml:space="preserve">Field yang sudah diketahui:</w:t>
+      </w:r>
+    </w:p>
+    <w:p>
+      <w:pPr>
+        <w:spacing w:after="0"/>
+      </w:pPr>
+      <w:r>
+        <w:rPr>
+          <w:rFonts w:ascii="Consolas" w:cs="Consolas" w:eastAsia="Consolas" w:hAnsi="Consolas"/>
+          <w:color w:val="333333"/>
+          <w:sz w:val="18"/>
+          <w:szCs w:val="18"/>
+        </w:rPr>
+        <w:t xml:space="preserve">- Nama Kegiatan: &lt;extracted activity name&gt;</w:t>
+      </w:r>
+    </w:p>
+    <w:p>
+      <w:pPr>
+        <w:spacing w:after="0"/>
+      </w:pPr>
+      <w:r>
+        <w:rPr>
+          <w:rFonts w:ascii="Consolas" w:cs="Consolas" w:eastAsia="Consolas" w:hAnsi="Consolas"/>
+          <w:color w:val="333333"/>
+          <w:sz w:val="18"/>
+          <w:szCs w:val="18"/>
+        </w:rPr>
+        <w:t xml:space="preserve">- Penyelenggara: &lt;extracted organizer&gt;</w:t>
+      </w:r>
+    </w:p>
+    <w:p>
+      <w:pPr>
+        <w:spacing w:after="0"/>
+      </w:pPr>
+      <w:r>
+        <w:rPr>
+          <w:rFonts w:ascii="Consolas" w:cs="Consolas" w:eastAsia="Consolas" w:hAnsi="Consolas"/>
+          <w:color w:val="333333"/>
+          <w:sz w:val="18"/>
+          <w:szCs w:val="18"/>
+        </w:rPr>
+        <w:t xml:space="preserve">- Peran: &lt;extracted role&gt;</w:t>
+      </w:r>
+    </w:p>
+    <w:p>
+      <w:pPr>
+        <w:spacing w:after="0"/>
+      </w:pPr>
+      <w:r>
+        <w:rPr>
+          <w:rFonts w:ascii="Consolas" w:cs="Consolas" w:eastAsia="Consolas" w:hAnsi="Consolas"/>
+          <w:color w:val="333333"/>
+          <w:sz w:val="18"/>
+          <w:szCs w:val="18"/>
+        </w:rPr>
+        <w:t xml:space="preserve"/>
+      </w:r>
+    </w:p>
+    <w:p>
+      <w:pPr>
+        <w:spacing w:after="0"/>
+      </w:pPr>
+      <w:r>
+        <w:rPr>
+          <w:rFonts w:ascii="Consolas" w:cs="Consolas" w:eastAsia="Consolas" w:hAnsi="Consolas"/>
+          <w:color w:val="333333"/>
+          <w:sz w:val="18"/>
+          <w:szCs w:val="18"/>
+        </w:rPr>
+        <w:t xml:space="preserve">Jawaban (hanya satu opsi dari daftar, tanpa penjelasan):</w:t>
+      </w:r>
+    </w:p>
+    <w:p>
+      <w:pPr>
+        <w:spacing w:after="120"/>
+      </w:pPr>
+    </w:p>
+    <w:p>
+      <w:pPr>
+        <w:pStyle w:val="Heading3"/>
+        <w:spacing w:after="80" w:before="180"/>
+      </w:pPr>
+      <w:r>
+        <w:rPr>
+          <w:rFonts w:ascii="Arial" w:cs="Arial" w:eastAsia="Arial" w:hAnsi="Arial"/>
+        </w:rPr>
+        <w:t xml:space="preserve">Free Text Prompt (for other fields)</w:t>
+      </w:r>
+    </w:p>
+    <w:p>
+      <w:pPr>
+        <w:spacing w:after="0"/>
+      </w:pPr>
+      <w:r>
+        <w:rPr>
+          <w:rFonts w:ascii="Consolas" w:cs="Consolas" w:eastAsia="Consolas" w:hAnsi="Consolas"/>
+          <w:color w:val="333333"/>
+          <w:sz w:val="18"/>
+          <w:szCs w:val="18"/>
+        </w:rPr>
+        <w:t xml:space="preserve">Ekstrak &lt;field_label&gt; dari sertifikat berikut.</w:t>
+      </w:r>
+    </w:p>
+    <w:p>
+      <w:pPr>
+        <w:spacing w:after="0"/>
+      </w:pPr>
+      <w:r>
+        <w:rPr>
+          <w:rFonts w:ascii="Consolas" w:cs="Consolas" w:eastAsia="Consolas" w:hAnsi="Consolas"/>
+          <w:color w:val="333333"/>
+          <w:sz w:val="18"/>
+          <w:szCs w:val="18"/>
+        </w:rPr>
+        <w:t xml:space="preserve"/>
+      </w:r>
+    </w:p>
+    <w:p>
+      <w:pPr>
+        <w:spacing w:after="0"/>
+      </w:pPr>
+      <w:r>
+        <w:rPr>
+          <w:rFonts w:ascii="Consolas" w:cs="Consolas" w:eastAsia="Consolas" w:hAnsi="Consolas"/>
+          <w:color w:val="333333"/>
+          <w:sz w:val="18"/>
+          <w:szCs w:val="18"/>
+        </w:rPr>
+        <w:t xml:space="preserve">ATURAN:</w:t>
+      </w:r>
+    </w:p>
+    <w:p>
+      <w:pPr>
+        <w:spacing w:after="0"/>
+      </w:pPr>
+      <w:r>
+        <w:rPr>
+          <w:rFonts w:ascii="Consolas" w:cs="Consolas" w:eastAsia="Consolas" w:hAnsi="Consolas"/>
+          <w:color w:val="333333"/>
+          <w:sz w:val="18"/>
+          <w:szCs w:val="18"/>
+        </w:rPr>
+        <w:t xml:space="preserve">- Jawaban HANYA nilai field, tanpa penjelasan</w:t>
+      </w:r>
+    </w:p>
+    <w:p>
+      <w:pPr>
+        <w:spacing w:after="0"/>
+      </w:pPr>
+      <w:r>
+        <w:rPr>
+          <w:rFonts w:ascii="Consolas" w:cs="Consolas" w:eastAsia="Consolas" w:hAnsi="Consolas"/>
+          <w:color w:val="333333"/>
+          <w:sz w:val="18"/>
+          <w:szCs w:val="18"/>
+        </w:rPr>
+        <w:t xml:space="preserve">- Maksimal 100 karakter</w:t>
+      </w:r>
+    </w:p>
+    <w:p>
+      <w:pPr>
+        <w:spacing w:after="0"/>
+      </w:pPr>
+      <w:r>
+        <w:rPr>
+          <w:rFonts w:ascii="Consolas" w:cs="Consolas" w:eastAsia="Consolas" w:hAnsi="Consolas"/>
+          <w:color w:val="333333"/>
+          <w:sz w:val="18"/>
+          <w:szCs w:val="18"/>
+        </w:rPr>
+        <w:t xml:space="preserve">- Jika tidak ditemukan, jawab: TIDAK_DITEMUKAN</w:t>
+      </w:r>
+    </w:p>
+    <w:p>
+      <w:pPr>
+        <w:spacing w:after="0"/>
+      </w:pPr>
+      <w:r>
+        <w:rPr>
+          <w:rFonts w:ascii="Consolas" w:cs="Consolas" w:eastAsia="Consolas" w:hAnsi="Consolas"/>
+          <w:color w:val="333333"/>
+          <w:sz w:val="18"/>
+          <w:szCs w:val="18"/>
+        </w:rPr>
+        <w:t xml:space="preserve"/>
+      </w:r>
+    </w:p>
+    <w:p>
+      <w:pPr>
+        <w:spacing w:after="0"/>
+      </w:pPr>
+      <w:r>
+        <w:rPr>
+          <w:rFonts w:ascii="Consolas" w:cs="Consolas" w:eastAsia="Consolas" w:hAnsi="Consolas"/>
+          <w:color w:val="333333"/>
+          <w:sz w:val="18"/>
+          <w:szCs w:val="18"/>
+        </w:rPr>
+        <w:t xml:space="preserve">Teks sertifikat:</w:t>
+      </w:r>
+    </w:p>
+    <w:p>
+      <w:pPr>
+        <w:spacing w:after="0"/>
+      </w:pPr>
+      <w:r>
+        <w:rPr>
+          <w:rFonts w:ascii="Consolas" w:cs="Consolas" w:eastAsia="Consolas" w:hAnsi="Consolas"/>
+          <w:color w:val="333333"/>
+          <w:sz w:val="18"/>
+          <w:szCs w:val="18"/>
+        </w:rPr>
+        <w:t xml:space="preserve">&lt;full raw text of certificate&gt;</w:t>
+      </w:r>
+    </w:p>
+    <w:p>
+      <w:pPr>
+        <w:spacing w:after="0"/>
+      </w:pPr>
+      <w:r>
+        <w:rPr>
+          <w:rFonts w:ascii="Consolas" w:cs="Consolas" w:eastAsia="Consolas" w:hAnsi="Consolas"/>
+          <w:color w:val="333333"/>
+          <w:sz w:val="18"/>
+          <w:szCs w:val="18"/>
+        </w:rPr>
+        <w:t xml:space="preserve"/>
+      </w:r>
+    </w:p>
+    <w:p>
+      <w:pPr>
+        <w:spacing w:after="0"/>
+      </w:pPr>
+      <w:r>
+        <w:rPr>
+          <w:rFonts w:ascii="Consolas" w:cs="Consolas" w:eastAsia="Consolas" w:hAnsi="Consolas"/>
+          <w:color w:val="333333"/>
+          <w:sz w:val="18"/>
+          <w:szCs w:val="18"/>
+        </w:rPr>
+        <w:t xml:space="preserve">Field yang sudah diketahui:</w:t>
+      </w:r>
+    </w:p>
+    <w:p>
+      <w:pPr>
+        <w:spacing w:after="0"/>
+      </w:pPr>
+      <w:r>
+        <w:rPr>
+          <w:rFonts w:ascii="Consolas" w:cs="Consolas" w:eastAsia="Consolas" w:hAnsi="Consolas"/>
+          <w:color w:val="333333"/>
+          <w:sz w:val="18"/>
+          <w:szCs w:val="18"/>
+        </w:rPr>
+        <w:t xml:space="preserve">- Nama Kegiatan: &lt;extracted activity name&gt;</w:t>
+      </w:r>
+    </w:p>
+    <w:p>
+      <w:pPr>
+        <w:spacing w:after="0"/>
+      </w:pPr>
+      <w:r>
+        <w:rPr>
+          <w:rFonts w:ascii="Consolas" w:cs="Consolas" w:eastAsia="Consolas" w:hAnsi="Consolas"/>
+          <w:color w:val="333333"/>
+          <w:sz w:val="18"/>
+          <w:szCs w:val="18"/>
+        </w:rPr>
+        <w:t xml:space="preserve">- Penyelenggara: &lt;extracted organizer&gt;</w:t>
+      </w:r>
+    </w:p>
+    <w:p>
+      <w:pPr>
+        <w:spacing w:after="0"/>
+      </w:pPr>
+      <w:r>
+        <w:rPr>
+          <w:rFonts w:ascii="Consolas" w:cs="Consolas" w:eastAsia="Consolas" w:hAnsi="Consolas"/>
+          <w:color w:val="333333"/>
+          <w:sz w:val="18"/>
+          <w:szCs w:val="18"/>
+        </w:rPr>
+        <w:t xml:space="preserve">- Peran: &lt;extracted role&gt;</w:t>
+      </w:r>
+    </w:p>
+    <w:p>
+      <w:pPr>
+        <w:spacing w:after="0"/>
+      </w:pPr>
+      <w:r>
+        <w:rPr>
+          <w:rFonts w:ascii="Consolas" w:cs="Consolas" w:eastAsia="Consolas" w:hAnsi="Consolas"/>
+          <w:color w:val="333333"/>
+          <w:sz w:val="18"/>
+          <w:szCs w:val="18"/>
+        </w:rPr>
+        <w:t xml:space="preserve"/>
+      </w:r>
+    </w:p>
+    <w:p>
+      <w:pPr>
+        <w:spacing w:after="0"/>
+      </w:pPr>
+      <w:r>
+        <w:rPr>
+          <w:rFonts w:ascii="Consolas" w:cs="Consolas" w:eastAsia="Consolas" w:hAnsi="Consolas"/>
+          <w:color w:val="333333"/>
+          <w:sz w:val="18"/>
+          <w:szCs w:val="18"/>
+        </w:rPr>
+        <w:t xml:space="preserve">Jawaban:</w:t>
+      </w:r>
+    </w:p>
+    <w:p>
+      <w:pPr>
+        <w:spacing w:after="120"/>
+      </w:pPr>
+    </w:p>
+    <w:p>
+      <w:pPr>
+        <w:pStyle w:val="Heading2"/>
+        <w:spacing w:after="120" w:before="240"/>
+      </w:pPr>
+      <w:r>
+        <w:rPr>
+          <w:rFonts w:ascii="Arial" w:cs="Arial" w:eastAsia="Arial" w:hAnsi="Arial"/>
+        </w:rPr>
+        <w:t xml:space="preserve">7.5 Output</w:t>
       </w:r>
     </w:p>
     <w:p>
@@ -6994,7 +7781,7 @@
         <w:rPr>
           <w:rFonts w:ascii="Arial" w:cs="Arial" w:eastAsia="Arial" w:hAnsi="Arial"/>
         </w:rPr>
-        <w:t xml:space="preserve">7.5 Configuration</w:t>
+        <w:t xml:space="preserve">7.6 Configuration</w:t>
       </w:r>
     </w:p>
     <w:tbl>
@@ -7631,7 +8418,7 @@
         <w:rPr>
           <w:rFonts w:ascii="Arial" w:cs="Arial" w:eastAsia="Arial" w:hAnsi="Arial"/>
         </w:rPr>
-        <w:t xml:space="preserve">7.6 Strengths</w:t>
+        <w:t xml:space="preserve">7.7 Strengths</w:t>
       </w:r>
     </w:p>
     <w:p>
@@ -7697,7 +8484,7 @@
         <w:rPr>
           <w:rFonts w:ascii="Arial" w:cs="Arial" w:eastAsia="Arial" w:hAnsi="Arial"/>
         </w:rPr>
-        <w:t xml:space="preserve">7.7 Limitations</w:t>
+        <w:t xml:space="preserve">7.8 Limitations</w:t>
       </w:r>
     </w:p>
     <w:p>
@@ -7781,7 +8568,7 @@
         <w:rPr>
           <w:rFonts w:ascii="Arial" w:cs="Arial" w:eastAsia="Arial" w:hAnsi="Arial"/>
         </w:rPr>
-        <w:t xml:space="preserve">7.8 Code Reference</w:t>
+        <w:t xml:space="preserve">7.9 Code Reference</w:t>
       </w:r>
     </w:p>
     <w:p>
@@ -8869,7 +9656,1060 @@
         <w:rPr>
           <w:rFonts w:ascii="Arial" w:cs="Arial" w:eastAsia="Arial" w:hAnsi="Arial"/>
         </w:rPr>
-        <w:t xml:space="preserve">8.4 Output</w:t>
+        <w:t xml:space="preserve">8.4 Prompt</w:t>
+      </w:r>
+    </w:p>
+    <w:p>
+      <w:pPr>
+        <w:spacing w:after="100"/>
+      </w:pPr>
+      <w:r>
+        <w:rPr>
+          <w:rFonts w:ascii="Arial" w:cs="Arial" w:eastAsia="Arial" w:hAnsi="Arial"/>
+          <w:sz w:val="22"/>
+          <w:szCs w:val="22"/>
+        </w:rPr>
+        <w:t xml:space="preserve">The prompt tells the language model exactly what to extract. Each prompt contains instructions, rules, heuristic guidance, approved options, the certificate text (or context), and the answer format.</w:t>
+      </w:r>
+    </w:p>
+    <w:p>
+      <w:pPr>
+        <w:pStyle w:val="Heading3"/>
+        <w:spacing w:after="80" w:before="180"/>
+      </w:pPr>
+      <w:r>
+        <w:rPr>
+          <w:rFonts w:ascii="Arial" w:cs="Arial" w:eastAsia="Arial" w:hAnsi="Arial"/>
+        </w:rPr>
+        <w:t xml:space="preserve">Variant A: Context-Only Prompt</w:t>
+      </w:r>
+    </w:p>
+    <w:p>
+      <w:pPr>
+        <w:spacing w:after="0"/>
+      </w:pPr>
+      <w:r>
+        <w:rPr>
+          <w:rFonts w:ascii="Consolas" w:cs="Consolas" w:eastAsia="Consolas" w:hAnsi="Consolas"/>
+          <w:color w:val="333333"/>
+          <w:sz w:val="18"/>
+          <w:szCs w:val="18"/>
+        </w:rPr>
+        <w:t xml:space="preserve">Tentukan tingkat kegiatan dari informasi berikut.</w:t>
+      </w:r>
+    </w:p>
+    <w:p>
+      <w:pPr>
+        <w:spacing w:after="0"/>
+      </w:pPr>
+      <w:r>
+        <w:rPr>
+          <w:rFonts w:ascii="Consolas" w:cs="Consolas" w:eastAsia="Consolas" w:hAnsi="Consolas"/>
+          <w:color w:val="333333"/>
+          <w:sz w:val="18"/>
+          <w:szCs w:val="18"/>
+        </w:rPr>
+        <w:t xml:space="preserve"/>
+      </w:r>
+    </w:p>
+    <w:p>
+      <w:pPr>
+        <w:spacing w:after="0"/>
+      </w:pPr>
+      <w:r>
+        <w:rPr>
+          <w:rFonts w:ascii="Consolas" w:cs="Consolas" w:eastAsia="Consolas" w:hAnsi="Consolas"/>
+          <w:color w:val="333333"/>
+          <w:sz w:val="18"/>
+          <w:szCs w:val="18"/>
+        </w:rPr>
+        <w:t xml:space="preserve">ATURAN WAJIB:</w:t>
+      </w:r>
+    </w:p>
+    <w:p>
+      <w:pPr>
+        <w:spacing w:after="0"/>
+      </w:pPr>
+      <w:r>
+        <w:rPr>
+          <w:rFonts w:ascii="Consolas" w:cs="Consolas" w:eastAsia="Consolas" w:hAnsi="Consolas"/>
+          <w:color w:val="333333"/>
+          <w:sz w:val="18"/>
+          <w:szCs w:val="18"/>
+        </w:rPr>
+        <w:t xml:space="preserve">- Jawaban HARUS persis salah satu dari opsi di bawah</w:t>
+      </w:r>
+    </w:p>
+    <w:p>
+      <w:pPr>
+        <w:spacing w:after="0"/>
+      </w:pPr>
+      <w:r>
+        <w:rPr>
+          <w:rFonts w:ascii="Consolas" w:cs="Consolas" w:eastAsia="Consolas" w:hAnsi="Consolas"/>
+          <w:color w:val="333333"/>
+          <w:sz w:val="18"/>
+          <w:szCs w:val="18"/>
+        </w:rPr>
+        <w:t xml:space="preserve">- JANGAN jawab selain opsi ini</w:t>
+      </w:r>
+    </w:p>
+    <w:p>
+      <w:pPr>
+        <w:spacing w:after="0"/>
+      </w:pPr>
+      <w:r>
+        <w:rPr>
+          <w:rFonts w:ascii="Consolas" w:cs="Consolas" w:eastAsia="Consolas" w:hAnsi="Consolas"/>
+          <w:color w:val="333333"/>
+          <w:sz w:val="18"/>
+          <w:szCs w:val="18"/>
+        </w:rPr>
+        <w:t xml:space="preserve">- Jika tidak yakin, pilih yang paling mendekati</w:t>
+      </w:r>
+    </w:p>
+    <w:p>
+      <w:pPr>
+        <w:spacing w:after="0"/>
+      </w:pPr>
+      <w:r>
+        <w:rPr>
+          <w:rFonts w:ascii="Consolas" w:cs="Consolas" w:eastAsia="Consolas" w:hAnsi="Consolas"/>
+          <w:color w:val="333333"/>
+          <w:sz w:val="18"/>
+          <w:szCs w:val="18"/>
+        </w:rPr>
+        <w:t xml:space="preserve"/>
+      </w:r>
+    </w:p>
+    <w:p>
+      <w:pPr>
+        <w:spacing w:after="0"/>
+      </w:pPr>
+      <w:r>
+        <w:rPr>
+          <w:rFonts w:ascii="Consolas" w:cs="Consolas" w:eastAsia="Consolas" w:hAnsi="Consolas"/>
+          <w:color w:val="333333"/>
+          <w:sz w:val="18"/>
+          <w:szCs w:val="18"/>
+        </w:rPr>
+        <w:t xml:space="preserve">PETUNJUK TINGKAT:</w:t>
+      </w:r>
+    </w:p>
+    <w:p>
+      <w:pPr>
+        <w:spacing w:after="0"/>
+      </w:pPr>
+      <w:r>
+        <w:rPr>
+          <w:rFonts w:ascii="Consolas" w:cs="Consolas" w:eastAsia="Consolas" w:hAnsi="Consolas"/>
+          <w:color w:val="333333"/>
+          <w:sz w:val="18"/>
+          <w:szCs w:val="18"/>
+        </w:rPr>
+        <w:t xml:space="preserve">- Jika sertifikat menyebut DEPARTMENT/DEPT/STUDY PROGRAM</w:t>
+      </w:r>
+    </w:p>
+    <w:p>
+      <w:pPr>
+        <w:spacing w:after="0"/>
+      </w:pPr>
+      <w:r>
+        <w:rPr>
+          <w:rFonts w:ascii="Consolas" w:cs="Consolas" w:eastAsia="Consolas" w:hAnsi="Consolas"/>
+          <w:color w:val="333333"/>
+          <w:sz w:val="18"/>
+          <w:szCs w:val="18"/>
+        </w:rPr>
+        <w:t xml:space="preserve">  (bahasa Inggris), maka == Departemen/Program Studi</w:t>
+      </w:r>
+    </w:p>
+    <w:p>
+      <w:pPr>
+        <w:spacing w:after="0"/>
+      </w:pPr>
+      <w:r>
+        <w:rPr>
+          <w:rFonts w:ascii="Consolas" w:cs="Consolas" w:eastAsia="Consolas" w:hAnsi="Consolas"/>
+          <w:color w:val="333333"/>
+          <w:sz w:val="18"/>
+          <w:szCs w:val="18"/>
+        </w:rPr>
+        <w:t xml:space="preserve">- Jika diselenggarakan oleh BEM/Badan Eksekutif Mahasiswa tingkat</w:t>
+      </w:r>
+    </w:p>
+    <w:p>
+      <w:pPr>
+        <w:spacing w:after="0"/>
+      </w:pPr>
+      <w:r>
+        <w:rPr>
+          <w:rFonts w:ascii="Consolas" w:cs="Consolas" w:eastAsia="Consolas" w:hAnsi="Consolas"/>
+          <w:color w:val="333333"/>
+          <w:sz w:val="18"/>
+          <w:szCs w:val="18"/>
+        </w:rPr>
+        <w:t xml:space="preserve">  FAKULTAS (BEM FEB, BEM FKM, BEM FTMM), maka == Fakultas</w:t>
+      </w:r>
+    </w:p>
+    <w:p>
+      <w:pPr>
+        <w:spacing w:after="0"/>
+      </w:pPr>
+      <w:r>
+        <w:rPr>
+          <w:rFonts w:ascii="Consolas" w:cs="Consolas" w:eastAsia="Consolas" w:hAnsi="Consolas"/>
+          <w:color w:val="333333"/>
+          <w:sz w:val="18"/>
+          <w:szCs w:val="18"/>
+        </w:rPr>
+        <w:t xml:space="preserve">- Jika diselenggarakan oleh HIMA/Himpunan Mahasiswa</w:t>
+      </w:r>
+    </w:p>
+    <w:p>
+      <w:pPr>
+        <w:spacing w:after="0"/>
+      </w:pPr>
+      <w:r>
+        <w:rPr>
+          <w:rFonts w:ascii="Consolas" w:cs="Consolas" w:eastAsia="Consolas" w:hAnsi="Consolas"/>
+          <w:color w:val="333333"/>
+          <w:sz w:val="18"/>
+          <w:szCs w:val="18"/>
+        </w:rPr>
+        <w:t xml:space="preserve">  (HIMATESDA, HIMANO), maka == Departemen/Program Studi</w:t>
+      </w:r>
+    </w:p>
+    <w:p>
+      <w:pPr>
+        <w:spacing w:after="0"/>
+      </w:pPr>
+      <w:r>
+        <w:rPr>
+          <w:rFonts w:ascii="Consolas" w:cs="Consolas" w:eastAsia="Consolas" w:hAnsi="Consolas"/>
+          <w:color w:val="333333"/>
+          <w:sz w:val="18"/>
+          <w:szCs w:val="18"/>
+        </w:rPr>
+        <w:t xml:space="preserve">- Jika diselenggarakan oleh BEM Universitas, Rektorat,</w:t>
+      </w:r>
+    </w:p>
+    <w:p>
+      <w:pPr>
+        <w:spacing w:after="0"/>
+      </w:pPr>
+      <w:r>
+        <w:rPr>
+          <w:rFonts w:ascii="Consolas" w:cs="Consolas" w:eastAsia="Consolas" w:hAnsi="Consolas"/>
+          <w:color w:val="333333"/>
+          <w:sz w:val="18"/>
+          <w:szCs w:val="18"/>
+        </w:rPr>
+        <w:t xml:space="preserve">  Direktorat Kemahasiswaan, maka == Universitas</w:t>
+      </w:r>
+    </w:p>
+    <w:p>
+      <w:pPr>
+        <w:spacing w:after="0"/>
+      </w:pPr>
+      <w:r>
+        <w:rPr>
+          <w:rFonts w:ascii="Consolas" w:cs="Consolas" w:eastAsia="Consolas" w:hAnsi="Consolas"/>
+          <w:color w:val="333333"/>
+          <w:sz w:val="18"/>
+          <w:szCs w:val="18"/>
+        </w:rPr>
+        <w:t xml:space="preserve">- Jika kegiatan berskala nasional, maka == Nasional</w:t>
+      </w:r>
+    </w:p>
+    <w:p>
+      <w:pPr>
+        <w:spacing w:after="0"/>
+      </w:pPr>
+      <w:r>
+        <w:rPr>
+          <w:rFonts w:ascii="Consolas" w:cs="Consolas" w:eastAsia="Consolas" w:hAnsi="Consolas"/>
+          <w:color w:val="333333"/>
+          <w:sz w:val="18"/>
+          <w:szCs w:val="18"/>
+        </w:rPr>
+        <w:t xml:space="preserve">- Jika kegiatan berskala internasional, maka == Internasional</w:t>
+      </w:r>
+    </w:p>
+    <w:p>
+      <w:pPr>
+        <w:spacing w:after="0"/>
+      </w:pPr>
+      <w:r>
+        <w:rPr>
+          <w:rFonts w:ascii="Consolas" w:cs="Consolas" w:eastAsia="Consolas" w:hAnsi="Consolas"/>
+          <w:color w:val="333333"/>
+          <w:sz w:val="18"/>
+          <w:szCs w:val="18"/>
+        </w:rPr>
+        <w:t xml:space="preserve">- 'UNIVERSITAS AIRLANGGA' adalah institusi induk, BUKAN penentu tingkat</w:t>
+      </w:r>
+    </w:p>
+    <w:p>
+      <w:pPr>
+        <w:spacing w:after="0"/>
+      </w:pPr>
+      <w:r>
+        <w:rPr>
+          <w:rFonts w:ascii="Consolas" w:cs="Consolas" w:eastAsia="Consolas" w:hAnsi="Consolas"/>
+          <w:color w:val="333333"/>
+          <w:sz w:val="18"/>
+          <w:szCs w:val="18"/>
+        </w:rPr>
+        <w:t xml:space="preserve"/>
+      </w:r>
+    </w:p>
+    <w:p>
+      <w:pPr>
+        <w:spacing w:after="0"/>
+      </w:pPr>
+      <w:r>
+        <w:rPr>
+          <w:rFonts w:ascii="Consolas" w:cs="Consolas" w:eastAsia="Consolas" w:hAnsi="Consolas"/>
+          <w:color w:val="333333"/>
+          <w:sz w:val="18"/>
+          <w:szCs w:val="18"/>
+        </w:rPr>
+        <w:t xml:space="preserve">Opsi yang diizinkan:</w:t>
+      </w:r>
+    </w:p>
+    <w:p>
+      <w:pPr>
+        <w:spacing w:after="0"/>
+      </w:pPr>
+      <w:r>
+        <w:rPr>
+          <w:rFonts w:ascii="Consolas" w:cs="Consolas" w:eastAsia="Consolas" w:hAnsi="Consolas"/>
+          <w:color w:val="333333"/>
+          <w:sz w:val="18"/>
+          <w:szCs w:val="18"/>
+        </w:rPr>
+        <w:t xml:space="preserve">- Internasional</w:t>
+      </w:r>
+    </w:p>
+    <w:p>
+      <w:pPr>
+        <w:spacing w:after="0"/>
+      </w:pPr>
+      <w:r>
+        <w:rPr>
+          <w:rFonts w:ascii="Consolas" w:cs="Consolas" w:eastAsia="Consolas" w:hAnsi="Consolas"/>
+          <w:color w:val="333333"/>
+          <w:sz w:val="18"/>
+          <w:szCs w:val="18"/>
+        </w:rPr>
+        <w:t xml:space="preserve">- Nasional</w:t>
+      </w:r>
+    </w:p>
+    <w:p>
+      <w:pPr>
+        <w:spacing w:after="0"/>
+      </w:pPr>
+      <w:r>
+        <w:rPr>
+          <w:rFonts w:ascii="Consolas" w:cs="Consolas" w:eastAsia="Consolas" w:hAnsi="Consolas"/>
+          <w:color w:val="333333"/>
+          <w:sz w:val="18"/>
+          <w:szCs w:val="18"/>
+        </w:rPr>
+        <w:t xml:space="preserve">- Universitas</w:t>
+      </w:r>
+    </w:p>
+    <w:p>
+      <w:pPr>
+        <w:spacing w:after="0"/>
+      </w:pPr>
+      <w:r>
+        <w:rPr>
+          <w:rFonts w:ascii="Consolas" w:cs="Consolas" w:eastAsia="Consolas" w:hAnsi="Consolas"/>
+          <w:color w:val="333333"/>
+          <w:sz w:val="18"/>
+          <w:szCs w:val="18"/>
+        </w:rPr>
+        <w:t xml:space="preserve">- Fakultas</w:t>
+      </w:r>
+    </w:p>
+    <w:p>
+      <w:pPr>
+        <w:spacing w:after="0"/>
+      </w:pPr>
+      <w:r>
+        <w:rPr>
+          <w:rFonts w:ascii="Consolas" w:cs="Consolas" w:eastAsia="Consolas" w:hAnsi="Consolas"/>
+          <w:color w:val="333333"/>
+          <w:sz w:val="18"/>
+          <w:szCs w:val="18"/>
+        </w:rPr>
+        <w:t xml:space="preserve">- Departemen/Program Studi</w:t>
+      </w:r>
+    </w:p>
+    <w:p>
+      <w:pPr>
+        <w:spacing w:after="0"/>
+      </w:pPr>
+      <w:r>
+        <w:rPr>
+          <w:rFonts w:ascii="Consolas" w:cs="Consolas" w:eastAsia="Consolas" w:hAnsi="Consolas"/>
+          <w:color w:val="333333"/>
+          <w:sz w:val="18"/>
+          <w:szCs w:val="18"/>
+        </w:rPr>
+        <w:t xml:space="preserve">- Lainnya</w:t>
+      </w:r>
+    </w:p>
+    <w:p>
+      <w:pPr>
+        <w:spacing w:after="0"/>
+      </w:pPr>
+      <w:r>
+        <w:rPr>
+          <w:rFonts w:ascii="Consolas" w:cs="Consolas" w:eastAsia="Consolas" w:hAnsi="Consolas"/>
+          <w:color w:val="333333"/>
+          <w:sz w:val="18"/>
+          <w:szCs w:val="18"/>
+        </w:rPr>
+        <w:t xml:space="preserve"/>
+      </w:r>
+    </w:p>
+    <w:p>
+      <w:pPr>
+        <w:spacing w:after="0"/>
+      </w:pPr>
+      <w:r>
+        <w:rPr>
+          <w:rFonts w:ascii="Consolas" w:cs="Consolas" w:eastAsia="Consolas" w:hAnsi="Consolas"/>
+          <w:color w:val="333333"/>
+          <w:sz w:val="18"/>
+          <w:szCs w:val="18"/>
+        </w:rPr>
+        <w:t xml:space="preserve">Field yang sudah diketahui (dari pipeline):</w:t>
+      </w:r>
+    </w:p>
+    <w:p>
+      <w:pPr>
+        <w:spacing w:after="0"/>
+      </w:pPr>
+      <w:r>
+        <w:rPr>
+          <w:rFonts w:ascii="Consolas" w:cs="Consolas" w:eastAsia="Consolas" w:hAnsi="Consolas"/>
+          <w:color w:val="333333"/>
+          <w:sz w:val="18"/>
+          <w:szCs w:val="18"/>
+        </w:rPr>
+        <w:t xml:space="preserve">- Nama Kegiatan: &lt;extracted activity name&gt;</w:t>
+      </w:r>
+    </w:p>
+    <w:p>
+      <w:pPr>
+        <w:spacing w:after="0"/>
+      </w:pPr>
+      <w:r>
+        <w:rPr>
+          <w:rFonts w:ascii="Consolas" w:cs="Consolas" w:eastAsia="Consolas" w:hAnsi="Consolas"/>
+          <w:color w:val="333333"/>
+          <w:sz w:val="18"/>
+          <w:szCs w:val="18"/>
+        </w:rPr>
+        <w:t xml:space="preserve">- Penyelenggara: &lt;extracted organizer&gt;</w:t>
+      </w:r>
+    </w:p>
+    <w:p>
+      <w:pPr>
+        <w:spacing w:after="0"/>
+      </w:pPr>
+      <w:r>
+        <w:rPr>
+          <w:rFonts w:ascii="Consolas" w:cs="Consolas" w:eastAsia="Consolas" w:hAnsi="Consolas"/>
+          <w:color w:val="333333"/>
+          <w:sz w:val="18"/>
+          <w:szCs w:val="18"/>
+        </w:rPr>
+        <w:t xml:space="preserve">- Peran: &lt;extracted role&gt;</w:t>
+      </w:r>
+    </w:p>
+    <w:p>
+      <w:pPr>
+        <w:spacing w:after="0"/>
+      </w:pPr>
+      <w:r>
+        <w:rPr>
+          <w:rFonts w:ascii="Consolas" w:cs="Consolas" w:eastAsia="Consolas" w:hAnsi="Consolas"/>
+          <w:color w:val="333333"/>
+          <w:sz w:val="18"/>
+          <w:szCs w:val="18"/>
+        </w:rPr>
+        <w:t xml:space="preserve"/>
+      </w:r>
+    </w:p>
+    <w:p>
+      <w:pPr>
+        <w:spacing w:after="0"/>
+      </w:pPr>
+      <w:r>
+        <w:rPr>
+          <w:rFonts w:ascii="Consolas" w:cs="Consolas" w:eastAsia="Consolas" w:hAnsi="Consolas"/>
+          <w:color w:val="333333"/>
+          <w:sz w:val="18"/>
+          <w:szCs w:val="18"/>
+        </w:rPr>
+        <w:t xml:space="preserve">Jawaban (hanya satu opsi dari daftar, tanpa penjelasan):</w:t>
+      </w:r>
+    </w:p>
+    <w:p>
+      <w:pPr>
+        <w:spacing w:after="120"/>
+      </w:pPr>
+    </w:p>
+    <w:p>
+      <w:pPr>
+        <w:pStyle w:val="Heading3"/>
+        <w:spacing w:after="80" w:before="180"/>
+      </w:pPr>
+      <w:r>
+        <w:rPr>
+          <w:rFonts w:ascii="Arial" w:cs="Arial" w:eastAsia="Arial" w:hAnsi="Arial"/>
+        </w:rPr>
+        <w:t xml:space="preserve">Variant B: Minimized-Text Prompt</w:t>
+      </w:r>
+    </w:p>
+    <w:p>
+      <w:pPr>
+        <w:spacing w:after="0"/>
+      </w:pPr>
+      <w:r>
+        <w:rPr>
+          <w:rFonts w:ascii="Consolas" w:cs="Consolas" w:eastAsia="Consolas" w:hAnsi="Consolas"/>
+          <w:color w:val="333333"/>
+          <w:sz w:val="18"/>
+          <w:szCs w:val="18"/>
+        </w:rPr>
+        <w:t xml:space="preserve">Tentukan tingkat kegiatan dari sertifikat berikut.</w:t>
+      </w:r>
+    </w:p>
+    <w:p>
+      <w:pPr>
+        <w:spacing w:after="0"/>
+      </w:pPr>
+      <w:r>
+        <w:rPr>
+          <w:rFonts w:ascii="Consolas" w:cs="Consolas" w:eastAsia="Consolas" w:hAnsi="Consolas"/>
+          <w:color w:val="333333"/>
+          <w:sz w:val="18"/>
+          <w:szCs w:val="18"/>
+        </w:rPr>
+        <w:t xml:space="preserve"/>
+      </w:r>
+    </w:p>
+    <w:p>
+      <w:pPr>
+        <w:spacing w:after="0"/>
+      </w:pPr>
+      <w:r>
+        <w:rPr>
+          <w:rFonts w:ascii="Consolas" w:cs="Consolas" w:eastAsia="Consolas" w:hAnsi="Consolas"/>
+          <w:color w:val="333333"/>
+          <w:sz w:val="18"/>
+          <w:szCs w:val="18"/>
+        </w:rPr>
+        <w:t xml:space="preserve">ATURAN WAJIB:</w:t>
+      </w:r>
+    </w:p>
+    <w:p>
+      <w:pPr>
+        <w:spacing w:after="0"/>
+      </w:pPr>
+      <w:r>
+        <w:rPr>
+          <w:rFonts w:ascii="Consolas" w:cs="Consolas" w:eastAsia="Consolas" w:hAnsi="Consolas"/>
+          <w:color w:val="333333"/>
+          <w:sz w:val="18"/>
+          <w:szCs w:val="18"/>
+        </w:rPr>
+        <w:t xml:space="preserve">- Jawaban HARUS persis salah satu dari opsi di bawah</w:t>
+      </w:r>
+    </w:p>
+    <w:p>
+      <w:pPr>
+        <w:spacing w:after="0"/>
+      </w:pPr>
+      <w:r>
+        <w:rPr>
+          <w:rFonts w:ascii="Consolas" w:cs="Consolas" w:eastAsia="Consolas" w:hAnsi="Consolas"/>
+          <w:color w:val="333333"/>
+          <w:sz w:val="18"/>
+          <w:szCs w:val="18"/>
+        </w:rPr>
+        <w:t xml:space="preserve">- JANGAN jawab selain opsi ini</w:t>
+      </w:r>
+    </w:p>
+    <w:p>
+      <w:pPr>
+        <w:spacing w:after="0"/>
+      </w:pPr>
+      <w:r>
+        <w:rPr>
+          <w:rFonts w:ascii="Consolas" w:cs="Consolas" w:eastAsia="Consolas" w:hAnsi="Consolas"/>
+          <w:color w:val="333333"/>
+          <w:sz w:val="18"/>
+          <w:szCs w:val="18"/>
+        </w:rPr>
+        <w:t xml:space="preserve">- Jika tidak yakin, pilih yang paling mendekati</w:t>
+      </w:r>
+    </w:p>
+    <w:p>
+      <w:pPr>
+        <w:spacing w:after="0"/>
+      </w:pPr>
+      <w:r>
+        <w:rPr>
+          <w:rFonts w:ascii="Consolas" w:cs="Consolas" w:eastAsia="Consolas" w:hAnsi="Consolas"/>
+          <w:color w:val="333333"/>
+          <w:sz w:val="18"/>
+          <w:szCs w:val="18"/>
+        </w:rPr>
+        <w:t xml:space="preserve"/>
+      </w:r>
+    </w:p>
+    <w:p>
+      <w:pPr>
+        <w:spacing w:after="0"/>
+      </w:pPr>
+      <w:r>
+        <w:rPr>
+          <w:rFonts w:ascii="Consolas" w:cs="Consolas" w:eastAsia="Consolas" w:hAnsi="Consolas"/>
+          <w:color w:val="333333"/>
+          <w:sz w:val="18"/>
+          <w:szCs w:val="18"/>
+        </w:rPr>
+        <w:t xml:space="preserve">PETUNJUK TINGKAT:</w:t>
+      </w:r>
+    </w:p>
+    <w:p>
+      <w:pPr>
+        <w:spacing w:after="0"/>
+      </w:pPr>
+      <w:r>
+        <w:rPr>
+          <w:rFonts w:ascii="Consolas" w:cs="Consolas" w:eastAsia="Consolas" w:hAnsi="Consolas"/>
+          <w:color w:val="333333"/>
+          <w:sz w:val="18"/>
+          <w:szCs w:val="18"/>
+        </w:rPr>
+        <w:t xml:space="preserve">- Jika sertifikat menyebut DEPARTMENT/DEPT/STUDY PROGRAM</w:t>
+      </w:r>
+    </w:p>
+    <w:p>
+      <w:pPr>
+        <w:spacing w:after="0"/>
+      </w:pPr>
+      <w:r>
+        <w:rPr>
+          <w:rFonts w:ascii="Consolas" w:cs="Consolas" w:eastAsia="Consolas" w:hAnsi="Consolas"/>
+          <w:color w:val="333333"/>
+          <w:sz w:val="18"/>
+          <w:szCs w:val="18"/>
+        </w:rPr>
+        <w:t xml:space="preserve">  (bahasa Inggris), maka == Departemen/Program Studi</w:t>
+      </w:r>
+    </w:p>
+    <w:p>
+      <w:pPr>
+        <w:spacing w:after="0"/>
+      </w:pPr>
+      <w:r>
+        <w:rPr>
+          <w:rFonts w:ascii="Consolas" w:cs="Consolas" w:eastAsia="Consolas" w:hAnsi="Consolas"/>
+          <w:color w:val="333333"/>
+          <w:sz w:val="18"/>
+          <w:szCs w:val="18"/>
+        </w:rPr>
+        <w:t xml:space="preserve">- Jika diselenggarakan oleh BEM/Badan Eksekutif Mahasiswa tingkat</w:t>
+      </w:r>
+    </w:p>
+    <w:p>
+      <w:pPr>
+        <w:spacing w:after="0"/>
+      </w:pPr>
+      <w:r>
+        <w:rPr>
+          <w:rFonts w:ascii="Consolas" w:cs="Consolas" w:eastAsia="Consolas" w:hAnsi="Consolas"/>
+          <w:color w:val="333333"/>
+          <w:sz w:val="18"/>
+          <w:szCs w:val="18"/>
+        </w:rPr>
+        <w:t xml:space="preserve">  FAKULTAS (BEM FEB, BEM FKM, BEM FTMM), maka == Fakultas</w:t>
+      </w:r>
+    </w:p>
+    <w:p>
+      <w:pPr>
+        <w:spacing w:after="0"/>
+      </w:pPr>
+      <w:r>
+        <w:rPr>
+          <w:rFonts w:ascii="Consolas" w:cs="Consolas" w:eastAsia="Consolas" w:hAnsi="Consolas"/>
+          <w:color w:val="333333"/>
+          <w:sz w:val="18"/>
+          <w:szCs w:val="18"/>
+        </w:rPr>
+        <w:t xml:space="preserve">- Jika diselenggarakan oleh HIMA/Himpunan Mahasiswa</w:t>
+      </w:r>
+    </w:p>
+    <w:p>
+      <w:pPr>
+        <w:spacing w:after="0"/>
+      </w:pPr>
+      <w:r>
+        <w:rPr>
+          <w:rFonts w:ascii="Consolas" w:cs="Consolas" w:eastAsia="Consolas" w:hAnsi="Consolas"/>
+          <w:color w:val="333333"/>
+          <w:sz w:val="18"/>
+          <w:szCs w:val="18"/>
+        </w:rPr>
+        <w:t xml:space="preserve">  (HIMATESDA, HIMANO), maka == Departemen/Program Studi</w:t>
+      </w:r>
+    </w:p>
+    <w:p>
+      <w:pPr>
+        <w:spacing w:after="0"/>
+      </w:pPr>
+      <w:r>
+        <w:rPr>
+          <w:rFonts w:ascii="Consolas" w:cs="Consolas" w:eastAsia="Consolas" w:hAnsi="Consolas"/>
+          <w:color w:val="333333"/>
+          <w:sz w:val="18"/>
+          <w:szCs w:val="18"/>
+        </w:rPr>
+        <w:t xml:space="preserve">- Jika diselenggarakan oleh BEM Universitas, Rektorat,</w:t>
+      </w:r>
+    </w:p>
+    <w:p>
+      <w:pPr>
+        <w:spacing w:after="0"/>
+      </w:pPr>
+      <w:r>
+        <w:rPr>
+          <w:rFonts w:ascii="Consolas" w:cs="Consolas" w:eastAsia="Consolas" w:hAnsi="Consolas"/>
+          <w:color w:val="333333"/>
+          <w:sz w:val="18"/>
+          <w:szCs w:val="18"/>
+        </w:rPr>
+        <w:t xml:space="preserve">  Direktorat Kemahasiswaan, maka == Universitas</w:t>
+      </w:r>
+    </w:p>
+    <w:p>
+      <w:pPr>
+        <w:spacing w:after="0"/>
+      </w:pPr>
+      <w:r>
+        <w:rPr>
+          <w:rFonts w:ascii="Consolas" w:cs="Consolas" w:eastAsia="Consolas" w:hAnsi="Consolas"/>
+          <w:color w:val="333333"/>
+          <w:sz w:val="18"/>
+          <w:szCs w:val="18"/>
+        </w:rPr>
+        <w:t xml:space="preserve">- Jika kegiatan berskala nasional, maka == Nasional</w:t>
+      </w:r>
+    </w:p>
+    <w:p>
+      <w:pPr>
+        <w:spacing w:after="0"/>
+      </w:pPr>
+      <w:r>
+        <w:rPr>
+          <w:rFonts w:ascii="Consolas" w:cs="Consolas" w:eastAsia="Consolas" w:hAnsi="Consolas"/>
+          <w:color w:val="333333"/>
+          <w:sz w:val="18"/>
+          <w:szCs w:val="18"/>
+        </w:rPr>
+        <w:t xml:space="preserve">- Jika kegiatan berskala internasional, maka == Internasional</w:t>
+      </w:r>
+    </w:p>
+    <w:p>
+      <w:pPr>
+        <w:spacing w:after="0"/>
+      </w:pPr>
+      <w:r>
+        <w:rPr>
+          <w:rFonts w:ascii="Consolas" w:cs="Consolas" w:eastAsia="Consolas" w:hAnsi="Consolas"/>
+          <w:color w:val="333333"/>
+          <w:sz w:val="18"/>
+          <w:szCs w:val="18"/>
+        </w:rPr>
+        <w:t xml:space="preserve">- 'UNIVERSITAS AIRLANGGA' adalah institusi induk, BUKAN penentu tingkat</w:t>
+      </w:r>
+    </w:p>
+    <w:p>
+      <w:pPr>
+        <w:spacing w:after="0"/>
+      </w:pPr>
+      <w:r>
+        <w:rPr>
+          <w:rFonts w:ascii="Consolas" w:cs="Consolas" w:eastAsia="Consolas" w:hAnsi="Consolas"/>
+          <w:color w:val="333333"/>
+          <w:sz w:val="18"/>
+          <w:szCs w:val="18"/>
+        </w:rPr>
+        <w:t xml:space="preserve"/>
+      </w:r>
+    </w:p>
+    <w:p>
+      <w:pPr>
+        <w:spacing w:after="0"/>
+      </w:pPr>
+      <w:r>
+        <w:rPr>
+          <w:rFonts w:ascii="Consolas" w:cs="Consolas" w:eastAsia="Consolas" w:hAnsi="Consolas"/>
+          <w:color w:val="333333"/>
+          <w:sz w:val="18"/>
+          <w:szCs w:val="18"/>
+        </w:rPr>
+        <w:t xml:space="preserve">Opsi yang diizinkan:</w:t>
+      </w:r>
+    </w:p>
+    <w:p>
+      <w:pPr>
+        <w:spacing w:after="0"/>
+      </w:pPr>
+      <w:r>
+        <w:rPr>
+          <w:rFonts w:ascii="Consolas" w:cs="Consolas" w:eastAsia="Consolas" w:hAnsi="Consolas"/>
+          <w:color w:val="333333"/>
+          <w:sz w:val="18"/>
+          <w:szCs w:val="18"/>
+        </w:rPr>
+        <w:t xml:space="preserve">- Internasional</w:t>
+      </w:r>
+    </w:p>
+    <w:p>
+      <w:pPr>
+        <w:spacing w:after="0"/>
+      </w:pPr>
+      <w:r>
+        <w:rPr>
+          <w:rFonts w:ascii="Consolas" w:cs="Consolas" w:eastAsia="Consolas" w:hAnsi="Consolas"/>
+          <w:color w:val="333333"/>
+          <w:sz w:val="18"/>
+          <w:szCs w:val="18"/>
+        </w:rPr>
+        <w:t xml:space="preserve">- Nasional</w:t>
+      </w:r>
+    </w:p>
+    <w:p>
+      <w:pPr>
+        <w:spacing w:after="0"/>
+      </w:pPr>
+      <w:r>
+        <w:rPr>
+          <w:rFonts w:ascii="Consolas" w:cs="Consolas" w:eastAsia="Consolas" w:hAnsi="Consolas"/>
+          <w:color w:val="333333"/>
+          <w:sz w:val="18"/>
+          <w:szCs w:val="18"/>
+        </w:rPr>
+        <w:t xml:space="preserve">- Universitas</w:t>
+      </w:r>
+    </w:p>
+    <w:p>
+      <w:pPr>
+        <w:spacing w:after="0"/>
+      </w:pPr>
+      <w:r>
+        <w:rPr>
+          <w:rFonts w:ascii="Consolas" w:cs="Consolas" w:eastAsia="Consolas" w:hAnsi="Consolas"/>
+          <w:color w:val="333333"/>
+          <w:sz w:val="18"/>
+          <w:szCs w:val="18"/>
+        </w:rPr>
+        <w:t xml:space="preserve">- Fakultas</w:t>
+      </w:r>
+    </w:p>
+    <w:p>
+      <w:pPr>
+        <w:spacing w:after="0"/>
+      </w:pPr>
+      <w:r>
+        <w:rPr>
+          <w:rFonts w:ascii="Consolas" w:cs="Consolas" w:eastAsia="Consolas" w:hAnsi="Consolas"/>
+          <w:color w:val="333333"/>
+          <w:sz w:val="18"/>
+          <w:szCs w:val="18"/>
+        </w:rPr>
+        <w:t xml:space="preserve">- Departemen/Program Studi</w:t>
+      </w:r>
+    </w:p>
+    <w:p>
+      <w:pPr>
+        <w:spacing w:after="0"/>
+      </w:pPr>
+      <w:r>
+        <w:rPr>
+          <w:rFonts w:ascii="Consolas" w:cs="Consolas" w:eastAsia="Consolas" w:hAnsi="Consolas"/>
+          <w:color w:val="333333"/>
+          <w:sz w:val="18"/>
+          <w:szCs w:val="18"/>
+        </w:rPr>
+        <w:t xml:space="preserve">- Lainnya</w:t>
+      </w:r>
+    </w:p>
+    <w:p>
+      <w:pPr>
+        <w:spacing w:after="0"/>
+      </w:pPr>
+      <w:r>
+        <w:rPr>
+          <w:rFonts w:ascii="Consolas" w:cs="Consolas" w:eastAsia="Consolas" w:hAnsi="Consolas"/>
+          <w:color w:val="333333"/>
+          <w:sz w:val="18"/>
+          <w:szCs w:val="18"/>
+        </w:rPr>
+        <w:t xml:space="preserve"/>
+      </w:r>
+    </w:p>
+    <w:p>
+      <w:pPr>
+        <w:spacing w:after="0"/>
+      </w:pPr>
+      <w:r>
+        <w:rPr>
+          <w:rFonts w:ascii="Consolas" w:cs="Consolas" w:eastAsia="Consolas" w:hAnsi="Consolas"/>
+          <w:color w:val="333333"/>
+          <w:sz w:val="18"/>
+          <w:szCs w:val="18"/>
+        </w:rPr>
+        <w:t xml:space="preserve">Teks sertifikat (bagian yang relevan):</w:t>
+      </w:r>
+    </w:p>
+    <w:p>
+      <w:pPr>
+        <w:spacing w:after="0"/>
+      </w:pPr>
+      <w:r>
+        <w:rPr>
+          <w:rFonts w:ascii="Consolas" w:cs="Consolas" w:eastAsia="Consolas" w:hAnsi="Consolas"/>
+          <w:color w:val="333333"/>
+          <w:sz w:val="18"/>
+          <w:szCs w:val="18"/>
+        </w:rPr>
+        <w:t xml:space="preserve">&lt;minimized text, ~300 chars, only tingkat-relevant lines&gt;</w:t>
+      </w:r>
+    </w:p>
+    <w:p>
+      <w:pPr>
+        <w:spacing w:after="0"/>
+      </w:pPr>
+      <w:r>
+        <w:rPr>
+          <w:rFonts w:ascii="Consolas" w:cs="Consolas" w:eastAsia="Consolas" w:hAnsi="Consolas"/>
+          <w:color w:val="333333"/>
+          <w:sz w:val="18"/>
+          <w:szCs w:val="18"/>
+        </w:rPr>
+        <w:t xml:space="preserve"/>
+      </w:r>
+    </w:p>
+    <w:p>
+      <w:pPr>
+        <w:spacing w:after="0"/>
+      </w:pPr>
+      <w:r>
+        <w:rPr>
+          <w:rFonts w:ascii="Consolas" w:cs="Consolas" w:eastAsia="Consolas" w:hAnsi="Consolas"/>
+          <w:color w:val="333333"/>
+          <w:sz w:val="18"/>
+          <w:szCs w:val="18"/>
+        </w:rPr>
+        <w:t xml:space="preserve">Field yang sudah diketahui (dari pipeline):</w:t>
+      </w:r>
+    </w:p>
+    <w:p>
+      <w:pPr>
+        <w:spacing w:after="0"/>
+      </w:pPr>
+      <w:r>
+        <w:rPr>
+          <w:rFonts w:ascii="Consolas" w:cs="Consolas" w:eastAsia="Consolas" w:hAnsi="Consolas"/>
+          <w:color w:val="333333"/>
+          <w:sz w:val="18"/>
+          <w:szCs w:val="18"/>
+        </w:rPr>
+        <w:t xml:space="preserve">- Nama Kegiatan: &lt;extracted activity name&gt;</w:t>
+      </w:r>
+    </w:p>
+    <w:p>
+      <w:pPr>
+        <w:spacing w:after="0"/>
+      </w:pPr>
+      <w:r>
+        <w:rPr>
+          <w:rFonts w:ascii="Consolas" w:cs="Consolas" w:eastAsia="Consolas" w:hAnsi="Consolas"/>
+          <w:color w:val="333333"/>
+          <w:sz w:val="18"/>
+          <w:szCs w:val="18"/>
+        </w:rPr>
+        <w:t xml:space="preserve">- Penyelenggara: &lt;extracted organizer&gt;</w:t>
+      </w:r>
+    </w:p>
+    <w:p>
+      <w:pPr>
+        <w:spacing w:after="0"/>
+      </w:pPr>
+      <w:r>
+        <w:rPr>
+          <w:rFonts w:ascii="Consolas" w:cs="Consolas" w:eastAsia="Consolas" w:hAnsi="Consolas"/>
+          <w:color w:val="333333"/>
+          <w:sz w:val="18"/>
+          <w:szCs w:val="18"/>
+        </w:rPr>
+        <w:t xml:space="preserve">- Peran: &lt;extracted role&gt;</w:t>
+      </w:r>
+    </w:p>
+    <w:p>
+      <w:pPr>
+        <w:spacing w:after="0"/>
+      </w:pPr>
+      <w:r>
+        <w:rPr>
+          <w:rFonts w:ascii="Consolas" w:cs="Consolas" w:eastAsia="Consolas" w:hAnsi="Consolas"/>
+          <w:color w:val="333333"/>
+          <w:sz w:val="18"/>
+          <w:szCs w:val="18"/>
+        </w:rPr>
+        <w:t xml:space="preserve"/>
+      </w:r>
+    </w:p>
+    <w:p>
+      <w:pPr>
+        <w:spacing w:after="0"/>
+      </w:pPr>
+      <w:r>
+        <w:rPr>
+          <w:rFonts w:ascii="Consolas" w:cs="Consolas" w:eastAsia="Consolas" w:hAnsi="Consolas"/>
+          <w:color w:val="333333"/>
+          <w:sz w:val="18"/>
+          <w:szCs w:val="18"/>
+        </w:rPr>
+        <w:t xml:space="preserve">Jawaban (hanya satu opsi dari daftar, tanpa penjelasan):</w:t>
+      </w:r>
+    </w:p>
+    <w:p>
+      <w:pPr>
+        <w:spacing w:after="120"/>
+      </w:pPr>
+    </w:p>
+    <w:p>
+      <w:pPr>
+        <w:pStyle w:val="Heading2"/>
+        <w:spacing w:after="120" w:before="240"/>
+      </w:pPr>
+      <w:r>
+        <w:rPr>
+          <w:rFonts w:ascii="Arial" w:cs="Arial" w:eastAsia="Arial" w:hAnsi="Arial"/>
+        </w:rPr>
+        <w:t xml:space="preserve">8.5 Output</w:t>
       </w:r>
     </w:p>
     <w:p>
@@ -8953,7 +10793,7 @@
         <w:rPr>
           <w:rFonts w:ascii="Arial" w:cs="Arial" w:eastAsia="Arial" w:hAnsi="Arial"/>
         </w:rPr>
-        <w:t xml:space="preserve">8.5 Configuration</w:t>
+        <w:t xml:space="preserve">8.6 Configuration</w:t>
       </w:r>
     </w:p>
     <w:tbl>
@@ -9504,7 +11344,7 @@
         <w:rPr>
           <w:rFonts w:ascii="Arial" w:cs="Arial" w:eastAsia="Arial" w:hAnsi="Arial"/>
         </w:rPr>
-        <w:t xml:space="preserve">8.6 Strengths</w:t>
+        <w:t xml:space="preserve">8.7 Strengths</w:t>
       </w:r>
     </w:p>
     <w:p>
@@ -9588,7 +11428,7 @@
         <w:rPr>
           <w:rFonts w:ascii="Arial" w:cs="Arial" w:eastAsia="Arial" w:hAnsi="Arial"/>
         </w:rPr>
-        <w:t xml:space="preserve">8.7 Limitations</w:t>
+        <w:t xml:space="preserve">8.8 Limitations</w:t>
       </w:r>
     </w:p>
     <w:p>
@@ -9690,7 +11530,7 @@
         <w:rPr>
           <w:rFonts w:ascii="Arial" w:cs="Arial" w:eastAsia="Arial" w:hAnsi="Arial"/>
         </w:rPr>
-        <w:t xml:space="preserve">8.8 Code Reference</w:t>
+        <w:t xml:space="preserve">8.9 Code Reference</w:t>
       </w:r>
     </w:p>
     <w:p>

</xml_diff>